<commit_message>
Build interactive portfolio and 1,936 Word templates
</commit_message>
<xml_diff>
--- a/docs/app-001/acceptance-minutes.docx
+++ b/docs/app-001/acceptance-minutes.docx
@@ -1013,6 +1013,871 @@
           <w:color w:val="777777"/>
         </w:rPr>
         <w:t xml:space="preserve">هذه الوثيقة قالب عمل داخلي قابل للتخصيص وليست نموذجًا رسميًا صادرًا عن منصة إحسان.</w:t>
+      </w:r>
+    </w:p>
+    <w:p>
+      <w:r>
+        <w:br w:type="page"/>
+      </w:r>
+    </w:p>
+    <w:p>
+      <w:pPr>
+        <w:bidi/>
+        <w:jc w:val="right"/>
+        <w:spacing w:after="120"/>
+      </w:pPr>
+      <w:r>
+        <w:rPr>
+          <w:rFonts w:ascii="Arial" w:hAnsi="Arial" w:cs="Arial"/>
+          <w:rtl/>
+          <w:sz w:val="32"/>
+          <w:szCs w:val="32"/>
+          <w:b/>
+          <w:color w:val="0D5C4A"/>
+        </w:rPr>
+        <w:t xml:space="preserve">ملحق: مطالبة احترافية للذكاء الاصطناعي</w:t>
+      </w:r>
+    </w:p>
+    <w:p>
+      <w:pPr>
+        <w:bidi/>
+        <w:jc w:val="right"/>
+        <w:spacing w:after="100"/>
+      </w:pPr>
+      <w:r>
+        <w:rPr>
+          <w:rFonts w:ascii="Arial" w:hAnsi="Arial" w:cs="Arial"/>
+          <w:rtl/>
+          <w:sz w:val="22"/>
+          <w:szCs w:val="22"/>
+          <w:color w:val="555555"/>
+        </w:rPr>
+        <w:t xml:space="preserve">الغرض: نسخ النص التالي إلى أي نموذج ذكاء اصطناعي لتوليد دراسة مشروع تنفيذية متكاملة ومخصصة لهذه الفرصة/المشروع.</w:t>
+      </w:r>
+    </w:p>
+    <w:p>
+      <w:pPr>
+        <w:bidi/>
+        <w:jc w:val="right"/>
+        <w:spacing w:after="40"/>
+      </w:pPr>
+      <w:r>
+        <w:rPr>
+          <w:rFonts w:ascii="Arial" w:hAnsi="Arial" w:cs="Arial"/>
+          <w:rtl/>
+          <w:sz w:val="22"/>
+          <w:szCs w:val="22"/>
+        </w:rPr>
+        <w:t xml:space="preserve">أنت مستشار أول في تصميم وإدارة المشاريع التنموية وغير الربحية وقياس الأثر، ومهمتك تحويل الفكرة التالية إلى دراسة مشروع تنفيذية متكاملة من الفكرة حتى الإغلاق.</w:t>
+      </w:r>
+    </w:p>
+    <w:p>
+      <w:pPr>
+        <w:bidi/>
+        <w:jc w:val="right"/>
+        <w:spacing w:after="40"/>
+      </w:pPr>
+      <w:r>
+        <w:rPr>
+          <w:rFonts w:ascii="Arial" w:hAnsi="Arial" w:cs="Arial"/>
+          <w:rtl/>
+          <w:sz w:val="20"/>
+          <w:szCs w:val="20"/>
+        </w:rPr>
+        <w:t xml:space="preserve"/>
+      </w:r>
+    </w:p>
+    <w:p>
+      <w:pPr>
+        <w:bidi/>
+        <w:jc w:val="right"/>
+        <w:spacing w:after="60"/>
+      </w:pPr>
+      <w:r>
+        <w:rPr>
+          <w:rFonts w:ascii="Arial" w:hAnsi="Arial" w:cs="Arial"/>
+          <w:rtl/>
+          <w:sz w:val="24"/>
+          <w:szCs w:val="24"/>
+          <w:b/>
+          <w:color w:val="0D5C4A"/>
+        </w:rPr>
+        <w:t xml:space="preserve">بيانات المشروع المتاحة:</w:t>
+      </w:r>
+    </w:p>
+    <w:p>
+      <w:pPr>
+        <w:bidi/>
+        <w:jc w:val="right"/>
+        <w:spacing w:after="40"/>
+      </w:pPr>
+      <w:r>
+        <w:rPr>
+          <w:rFonts w:ascii="Arial" w:hAnsi="Arial" w:cs="Arial"/>
+          <w:rtl/>
+          <w:sz w:val="22"/>
+          <w:szCs w:val="22"/>
+        </w:rPr>
+        <w:t xml:space="preserve">- اسم الفرصة/المشروع: الأحزمة الخضراء لتثبيت الرمال</w:t>
+      </w:r>
+    </w:p>
+    <w:p>
+      <w:pPr>
+        <w:bidi/>
+        <w:jc w:val="right"/>
+        <w:spacing w:after="40"/>
+      </w:pPr>
+      <w:r>
+        <w:rPr>
+          <w:rFonts w:ascii="Arial" w:hAnsi="Arial" w:cs="Arial"/>
+          <w:rtl/>
+          <w:sz w:val="22"/>
+          <w:szCs w:val="22"/>
+        </w:rPr>
+        <w:t xml:space="preserve">- المجال: غرس الأشجار لمكافحة التصحر</w:t>
+      </w:r>
+    </w:p>
+    <w:p>
+      <w:pPr>
+        <w:bidi/>
+        <w:jc w:val="right"/>
+        <w:spacing w:after="40"/>
+      </w:pPr>
+      <w:r>
+        <w:rPr>
+          <w:rFonts w:ascii="Arial" w:hAnsi="Arial" w:cs="Arial"/>
+          <w:rtl/>
+          <w:sz w:val="22"/>
+          <w:szCs w:val="22"/>
+        </w:rPr>
+        <w:t xml:space="preserve">- مسار التمويل: تبرعات/عام</w:t>
+      </w:r>
+    </w:p>
+    <w:p>
+      <w:pPr>
+        <w:bidi/>
+        <w:jc w:val="right"/>
+        <w:spacing w:after="40"/>
+      </w:pPr>
+      <w:r>
+        <w:rPr>
+          <w:rFonts w:ascii="Arial" w:hAnsi="Arial" w:cs="Arial"/>
+          <w:rtl/>
+          <w:sz w:val="22"/>
+          <w:szCs w:val="22"/>
+        </w:rPr>
+        <w:t xml:space="preserve">- الوصف الأولي: إنشاء أحزمة نباتية متعددة الصفوف حول القرى والمواقع المتأثرة بزحف الرمال بأنواع محلية.</w:t>
+      </w:r>
+    </w:p>
+    <w:p>
+      <w:pPr>
+        <w:bidi/>
+        <w:jc w:val="right"/>
+        <w:spacing w:after="40"/>
+      </w:pPr>
+      <w:r>
+        <w:rPr>
+          <w:rFonts w:ascii="Arial" w:hAnsi="Arial" w:cs="Arial"/>
+          <w:rtl/>
+          <w:sz w:val="22"/>
+          <w:szCs w:val="22"/>
+        </w:rPr>
+        <w:t xml:space="preserve">- الميزانية المرجعية إن وجدت: 250,000 — 450,000 ريال</w:t>
+      </w:r>
+    </w:p>
+    <w:p>
+      <w:pPr>
+        <w:bidi/>
+        <w:jc w:val="right"/>
+        <w:spacing w:after="40"/>
+      </w:pPr>
+      <w:r>
+        <w:rPr>
+          <w:rFonts w:ascii="Arial" w:hAnsi="Arial" w:cs="Arial"/>
+          <w:rtl/>
+          <w:sz w:val="22"/>
+          <w:szCs w:val="22"/>
+        </w:rPr>
+        <w:t xml:space="preserve">- المدة المرجعية إن وجدت: 12 + 24 متابعة</w:t>
+      </w:r>
+    </w:p>
+    <w:p>
+      <w:pPr>
+        <w:bidi/>
+        <w:jc w:val="right"/>
+        <w:spacing w:after="40"/>
+      </w:pPr>
+      <w:r>
+        <w:rPr>
+          <w:rFonts w:ascii="Arial" w:hAnsi="Arial" w:cs="Arial"/>
+          <w:rtl/>
+          <w:sz w:val="20"/>
+          <w:szCs w:val="20"/>
+        </w:rPr>
+        <w:t xml:space="preserve"/>
+      </w:r>
+    </w:p>
+    <w:p>
+      <w:pPr>
+        <w:bidi/>
+        <w:jc w:val="right"/>
+        <w:spacing w:after="60"/>
+      </w:pPr>
+      <w:r>
+        <w:rPr>
+          <w:rFonts w:ascii="Arial" w:hAnsi="Arial" w:cs="Arial"/>
+          <w:rtl/>
+          <w:sz w:val="24"/>
+          <w:szCs w:val="24"/>
+          <w:b/>
+          <w:color w:val="0D5C4A"/>
+        </w:rPr>
+        <w:t xml:space="preserve">قواعد إلزامية قبل الكتابة:</w:t>
+      </w:r>
+    </w:p>
+    <w:p>
+      <w:pPr>
+        <w:bidi/>
+        <w:jc w:val="right"/>
+        <w:spacing w:after="40"/>
+      </w:pPr>
+      <w:r>
+        <w:rPr>
+          <w:rFonts w:ascii="Arial" w:hAnsi="Arial" w:cs="Arial"/>
+          <w:rtl/>
+          <w:sz w:val="22"/>
+          <w:szCs w:val="22"/>
+        </w:rPr>
+        <w:t xml:space="preserve">1) لا تختلق أرقامًا أو نسبًا أو اشتراطات أو مصادر أو موافقات. أي معلومة غير متاحة ضع أمامها [يحتاج تحقق] أو [افتراض عمل] بحسب الحالة.</w:t>
+      </w:r>
+    </w:p>
+    <w:p>
+      <w:pPr>
+        <w:bidi/>
+        <w:jc w:val="right"/>
+        <w:spacing w:after="40"/>
+      </w:pPr>
+      <w:r>
+        <w:rPr>
+          <w:rFonts w:ascii="Arial" w:hAnsi="Arial" w:cs="Arial"/>
+          <w:rtl/>
+          <w:sz w:val="22"/>
+          <w:szCs w:val="22"/>
+        </w:rPr>
+        <w:t xml:space="preserve">2) افصل بوضوح بين: الحقائق المتاحة، الافتراضات، البيانات المطلوبة، والتوصيات.</w:t>
+      </w:r>
+    </w:p>
+    <w:p>
+      <w:pPr>
+        <w:bidi/>
+        <w:jc w:val="right"/>
+        <w:spacing w:after="40"/>
+      </w:pPr>
+      <w:r>
+        <w:rPr>
+          <w:rFonts w:ascii="Arial" w:hAnsi="Arial" w:cs="Arial"/>
+          <w:rtl/>
+          <w:sz w:val="22"/>
+          <w:szCs w:val="22"/>
+        </w:rPr>
+        <w:t xml:space="preserve">3) إذا كانت البيانات غير كافية، لا توقف العمل؛ أنشئ مسودة تنفيذية قابلة للاستكمال، ثم ضع قائمة قصيرة بالأسئلة الحرجة في النهاية.</w:t>
+      </w:r>
+    </w:p>
+    <w:p>
+      <w:pPr>
+        <w:bidi/>
+        <w:jc w:val="right"/>
+        <w:spacing w:after="40"/>
+      </w:pPr>
+      <w:r>
+        <w:rPr>
+          <w:rFonts w:ascii="Arial" w:hAnsi="Arial" w:cs="Arial"/>
+          <w:rtl/>
+          <w:sz w:val="22"/>
+          <w:szCs w:val="22"/>
+        </w:rPr>
+        <w:t xml:space="preserve">4) لا تنسب أي متطلب إلى منصة إحسان أو جهة تنظيمية إلا إذا زودتك به صراحة أو كان ضمن مصدر موثق مقدم لك.</w:t>
+      </w:r>
+    </w:p>
+    <w:p>
+      <w:pPr>
+        <w:bidi/>
+        <w:jc w:val="right"/>
+        <w:spacing w:after="40"/>
+      </w:pPr>
+      <w:r>
+        <w:rPr>
+          <w:rFonts w:ascii="Arial" w:hAnsi="Arial" w:cs="Arial"/>
+          <w:rtl/>
+          <w:sz w:val="22"/>
+          <w:szCs w:val="22"/>
+        </w:rPr>
+        <w:t xml:space="preserve">5) تحقق من مسار التمويل وضوابط الجهة والفرصة وقت التقديم، ولا تفترض متطلبات رسمية غير موثقة.</w:t>
+      </w:r>
+    </w:p>
+    <w:p>
+      <w:pPr>
+        <w:bidi/>
+        <w:jc w:val="right"/>
+        <w:spacing w:after="40"/>
+      </w:pPr>
+      <w:r>
+        <w:rPr>
+          <w:rFonts w:ascii="Arial" w:hAnsi="Arial" w:cs="Arial"/>
+          <w:rtl/>
+          <w:sz w:val="22"/>
+          <w:szCs w:val="22"/>
+        </w:rPr>
+        <w:t xml:space="preserve">6) اجعل المخرجات عملية وقابلة للنسخ إلى ملف مشروع، مع جداول واضحة حيث يلزم.</w:t>
+      </w:r>
+    </w:p>
+    <w:p>
+      <w:pPr>
+        <w:bidi/>
+        <w:jc w:val="right"/>
+        <w:spacing w:after="40"/>
+      </w:pPr>
+      <w:r>
+        <w:rPr>
+          <w:rFonts w:ascii="Arial" w:hAnsi="Arial" w:cs="Arial"/>
+          <w:rtl/>
+          <w:sz w:val="22"/>
+          <w:szCs w:val="22"/>
+        </w:rPr>
+        <w:t xml:space="preserve">7) اربط كل هدف بمؤشر، وكل مؤشر بمصدر تحقق، وكل خطر بمالك وإجراء استجابة.</w:t>
+      </w:r>
+    </w:p>
+    <w:p>
+      <w:pPr>
+        <w:bidi/>
+        <w:jc w:val="right"/>
+        <w:spacing w:after="40"/>
+      </w:pPr>
+      <w:r>
+        <w:rPr>
+          <w:rFonts w:ascii="Arial" w:hAnsi="Arial" w:cs="Arial"/>
+          <w:rtl/>
+          <w:sz w:val="22"/>
+          <w:szCs w:val="22"/>
+        </w:rPr>
+        <w:t xml:space="preserve">8) ميّز بين المخرجات Outputs والنتائج Outcomes والأثر Impact، ولا تخلط بينها.</w:t>
+      </w:r>
+    </w:p>
+    <w:p>
+      <w:pPr>
+        <w:bidi/>
+        <w:jc w:val="right"/>
+        <w:spacing w:after="40"/>
+      </w:pPr>
+      <w:r>
+        <w:rPr>
+          <w:rFonts w:ascii="Arial" w:hAnsi="Arial" w:cs="Arial"/>
+          <w:rtl/>
+          <w:sz w:val="22"/>
+          <w:szCs w:val="22"/>
+        </w:rPr>
+        <w:t xml:space="preserve">9) راعِ حماية بيانات المستفيدين والخصوصية وتقليل البيانات الحساسة إلى الحد الضروري.</w:t>
+      </w:r>
+    </w:p>
+    <w:p>
+      <w:pPr>
+        <w:bidi/>
+        <w:jc w:val="right"/>
+        <w:spacing w:after="40"/>
+      </w:pPr>
+      <w:r>
+        <w:rPr>
+          <w:rFonts w:ascii="Arial" w:hAnsi="Arial" w:cs="Arial"/>
+          <w:rtl/>
+          <w:sz w:val="20"/>
+          <w:szCs w:val="20"/>
+        </w:rPr>
+        <w:t xml:space="preserve"/>
+      </w:r>
+    </w:p>
+    <w:p>
+      <w:pPr>
+        <w:bidi/>
+        <w:jc w:val="right"/>
+        <w:spacing w:after="60"/>
+      </w:pPr>
+      <w:r>
+        <w:rPr>
+          <w:rFonts w:ascii="Arial" w:hAnsi="Arial" w:cs="Arial"/>
+          <w:rtl/>
+          <w:sz w:val="24"/>
+          <w:szCs w:val="24"/>
+          <w:b/>
+          <w:color w:val="0D5C4A"/>
+        </w:rPr>
+        <w:t xml:space="preserve">أنشئ الدراسة بالترتيب التالي:</w:t>
+      </w:r>
+    </w:p>
+    <w:p>
+      <w:pPr>
+        <w:bidi/>
+        <w:jc w:val="right"/>
+        <w:spacing w:after="40"/>
+      </w:pPr>
+      <w:r>
+        <w:rPr>
+          <w:rFonts w:ascii="Arial" w:hAnsi="Arial" w:cs="Arial"/>
+          <w:rtl/>
+          <w:sz w:val="22"/>
+          <w:szCs w:val="22"/>
+        </w:rPr>
+        <w:t xml:space="preserve">أولًا: الملخص التنفيذي — تعريف مختصر بالمشكلة، الحل، المستفيدين، القيمة التنموية، المدة والتكلفة المرجعية.</w:t>
+      </w:r>
+    </w:p>
+    <w:p>
+      <w:pPr>
+        <w:bidi/>
+        <w:jc w:val="right"/>
+        <w:spacing w:after="40"/>
+      </w:pPr>
+      <w:r>
+        <w:rPr>
+          <w:rFonts w:ascii="Arial" w:hAnsi="Arial" w:cs="Arial"/>
+          <w:rtl/>
+          <w:sz w:val="22"/>
+          <w:szCs w:val="22"/>
+        </w:rPr>
+        <w:t xml:space="preserve">ثانيًا: تعريف المشكلة والاحتياج — وصف المشكلة، أسبابها، حجمها، الفجوة الحالية، وما الأدلة المطلوبة لإثباتها.</w:t>
+      </w:r>
+    </w:p>
+    <w:p>
+      <w:pPr>
+        <w:bidi/>
+        <w:jc w:val="right"/>
+        <w:spacing w:after="40"/>
+      </w:pPr>
+      <w:r>
+        <w:rPr>
+          <w:rFonts w:ascii="Arial" w:hAnsi="Arial" w:cs="Arial"/>
+          <w:rtl/>
+          <w:sz w:val="22"/>
+          <w:szCs w:val="22"/>
+        </w:rPr>
+        <w:t xml:space="preserve">ثالثًا: الفئة المستهدفة والاستحقاق — الشرائح، العدد المتوقع، النطاق الجغرافي، معايير الأهلية، الأولوية، منع الازدواجية، وآلية التحقق.</w:t>
+      </w:r>
+    </w:p>
+    <w:p>
+      <w:pPr>
+        <w:bidi/>
+        <w:jc w:val="right"/>
+        <w:spacing w:after="40"/>
+      </w:pPr>
+      <w:r>
+        <w:rPr>
+          <w:rFonts w:ascii="Arial" w:hAnsi="Arial" w:cs="Arial"/>
+          <w:rtl/>
+          <w:sz w:val="22"/>
+          <w:szCs w:val="22"/>
+        </w:rPr>
+        <w:t xml:space="preserve">رابعًا: نظرية التغيير — المدخلات، الأنشطة، المخرجات، النتائج قصيرة/متوسطة المدى، والأثر المتوقع، مع أهم الافتراضات.</w:t>
+      </w:r>
+    </w:p>
+    <w:p>
+      <w:pPr>
+        <w:bidi/>
+        <w:jc w:val="right"/>
+        <w:spacing w:after="40"/>
+      </w:pPr>
+      <w:r>
+        <w:rPr>
+          <w:rFonts w:ascii="Arial" w:hAnsi="Arial" w:cs="Arial"/>
+          <w:rtl/>
+          <w:sz w:val="22"/>
+          <w:szCs w:val="22"/>
+        </w:rPr>
+        <w:t xml:space="preserve">خامسًا: الهدف العام والأهداف التفصيلية — أهداف SMART قابلة للقياس ومتصلة بالمشكلة.</w:t>
+      </w:r>
+    </w:p>
+    <w:p>
+      <w:pPr>
+        <w:bidi/>
+        <w:jc w:val="right"/>
+        <w:spacing w:after="40"/>
+      </w:pPr>
+      <w:r>
+        <w:rPr>
+          <w:rFonts w:ascii="Arial" w:hAnsi="Arial" w:cs="Arial"/>
+          <w:rtl/>
+          <w:sz w:val="22"/>
+          <w:szCs w:val="22"/>
+        </w:rPr>
+        <w:t xml:space="preserve">سادسًا: نطاق المشروع — ما يدخل في المشروع وما يخرج منه، وحدود المسؤولية والتسليمات النهائية.</w:t>
+      </w:r>
+    </w:p>
+    <w:p>
+      <w:pPr>
+        <w:bidi/>
+        <w:jc w:val="right"/>
+        <w:spacing w:after="40"/>
+      </w:pPr>
+      <w:r>
+        <w:rPr>
+          <w:rFonts w:ascii="Arial" w:hAnsi="Arial" w:cs="Arial"/>
+          <w:rtl/>
+          <w:sz w:val="22"/>
+          <w:szCs w:val="22"/>
+        </w:rPr>
+        <w:t xml:space="preserve">سابعًا: نموذج التدخل والأنشطة — مسار المستفيد أو الخدمة خطوة بخطوة من التسجيل/الترشيح حتى الاستلام والمتابعة.</w:t>
+      </w:r>
+    </w:p>
+    <w:p>
+      <w:pPr>
+        <w:bidi/>
+        <w:jc w:val="right"/>
+        <w:spacing w:after="40"/>
+      </w:pPr>
+      <w:r>
+        <w:rPr>
+          <w:rFonts w:ascii="Arial" w:hAnsi="Arial" w:cs="Arial"/>
+          <w:rtl/>
+          <w:sz w:val="22"/>
+          <w:szCs w:val="22"/>
+        </w:rPr>
+        <w:t xml:space="preserve">ثامنًا: خطة التنفيذ والجدول الزمني — مراحل، أنشطة، مسؤوليات، تبعيات، معالم رئيسية، ومدة تقديرية.</w:t>
+      </w:r>
+    </w:p>
+    <w:p>
+      <w:pPr>
+        <w:bidi/>
+        <w:jc w:val="right"/>
+        <w:spacing w:after="40"/>
+      </w:pPr>
+      <w:r>
+        <w:rPr>
+          <w:rFonts w:ascii="Arial" w:hAnsi="Arial" w:cs="Arial"/>
+          <w:rtl/>
+          <w:sz w:val="22"/>
+          <w:szCs w:val="22"/>
+        </w:rPr>
+        <w:t xml:space="preserve">تاسعًا: أصحاب المصلحة والحوكمة — الجهة المالكة، مدير المشروع، الشركاء، الموردون، لجان الاعتماد والاستلام، ومصفوفة RACI مختصرة.</w:t>
+      </w:r>
+    </w:p>
+    <w:p>
+      <w:pPr>
+        <w:bidi/>
+        <w:jc w:val="right"/>
+        <w:spacing w:after="40"/>
+      </w:pPr>
+      <w:r>
+        <w:rPr>
+          <w:rFonts w:ascii="Arial" w:hAnsi="Arial" w:cs="Arial"/>
+          <w:rtl/>
+          <w:sz w:val="22"/>
+          <w:szCs w:val="22"/>
+        </w:rPr>
+        <w:t xml:space="preserve">عاشرًا: الميزانية — بنود التكلفة، الكميات، سعر الوحدة، الإجمالي، الاحتياطي إن لزم، وافصل ما هو تقديري عما يحتاج عروض أسعار.</w:t>
+      </w:r>
+    </w:p>
+    <w:p>
+      <w:pPr>
+        <w:bidi/>
+        <w:jc w:val="right"/>
+        <w:spacing w:after="40"/>
+      </w:pPr>
+      <w:r>
+        <w:rPr>
+          <w:rFonts w:ascii="Arial" w:hAnsi="Arial" w:cs="Arial"/>
+          <w:rtl/>
+          <w:sz w:val="22"/>
+          <w:szCs w:val="22"/>
+        </w:rPr>
+        <w:t xml:space="preserve">الحادي عشر: الشراء والتعاقد — المواصفات، آلية المقارنة، معايير الترسية، الضمان، الدفع مقابل الإنجاز، ومحاضر الاستلام.</w:t>
+      </w:r>
+    </w:p>
+    <w:p>
+      <w:pPr>
+        <w:bidi/>
+        <w:jc w:val="right"/>
+        <w:spacing w:after="40"/>
+      </w:pPr>
+      <w:r>
+        <w:rPr>
+          <w:rFonts w:ascii="Arial" w:hAnsi="Arial" w:cs="Arial"/>
+          <w:rtl/>
+          <w:sz w:val="22"/>
+          <w:szCs w:val="22"/>
+        </w:rPr>
+        <w:t xml:space="preserve">الثاني عشر: سجل المخاطر — المخاطر التشغيلية والمالية والفنية والسمعة والخصوصية والسلامة، الاحتمال، الأثر، الاستجابة، المالك، ومؤشرات الإنذار.</w:t>
+      </w:r>
+    </w:p>
+    <w:p>
+      <w:pPr>
+        <w:bidi/>
+        <w:jc w:val="right"/>
+        <w:spacing w:after="40"/>
+      </w:pPr>
+      <w:r>
+        <w:rPr>
+          <w:rFonts w:ascii="Arial" w:hAnsi="Arial" w:cs="Arial"/>
+          <w:rtl/>
+          <w:sz w:val="22"/>
+          <w:szCs w:val="22"/>
+        </w:rPr>
+        <w:t xml:space="preserve">الثالث عشر: مؤشرات الأداء وقياس الأثر — خط الأساس، المستهدف، طريقة الحساب، مصدر البيانات، دورية القياس، ومسؤول القياس.</w:t>
+      </w:r>
+    </w:p>
+    <w:p>
+      <w:pPr>
+        <w:bidi/>
+        <w:jc w:val="right"/>
+        <w:spacing w:after="40"/>
+      </w:pPr>
+      <w:r>
+        <w:rPr>
+          <w:rFonts w:ascii="Arial" w:hAnsi="Arial" w:cs="Arial"/>
+          <w:rtl/>
+          <w:sz w:val="22"/>
+          <w:szCs w:val="22"/>
+        </w:rPr>
+        <w:t xml:space="preserve">الرابع عشر: الجودة والمتابعة والتقارير — نقاط الرقابة، قبول المخرجات، التقارير المرحلية، إدارة التغيير والانحرافات.</w:t>
+      </w:r>
+    </w:p>
+    <w:p>
+      <w:pPr>
+        <w:bidi/>
+        <w:jc w:val="right"/>
+        <w:spacing w:after="40"/>
+      </w:pPr>
+      <w:r>
+        <w:rPr>
+          <w:rFonts w:ascii="Arial" w:hAnsi="Arial" w:cs="Arial"/>
+          <w:rtl/>
+          <w:sz w:val="22"/>
+          <w:szCs w:val="22"/>
+        </w:rPr>
+        <w:t xml:space="preserve">الخامس عشر: الاستدامة — التشغيل بعد التمويل، الصيانة، ملكية الأصول، الشراكات، التمويل المستمر، وخطة الخروج عند الحاجة.</w:t>
+      </w:r>
+    </w:p>
+    <w:p>
+      <w:pPr>
+        <w:bidi/>
+        <w:jc w:val="right"/>
+        <w:spacing w:after="40"/>
+      </w:pPr>
+      <w:r>
+        <w:rPr>
+          <w:rFonts w:ascii="Arial" w:hAnsi="Arial" w:cs="Arial"/>
+          <w:rtl/>
+          <w:sz w:val="22"/>
+          <w:szCs w:val="22"/>
+        </w:rPr>
+        <w:t xml:space="preserve">السادس عشر: خطة الإغلاق — الاستلام النهائي، الإقفال المالي والتعاقدي، قياس النتائج، توثيق الأصول والضمانات، الدروس المستفادة، وأرشفة الأدلة.</w:t>
+      </w:r>
+    </w:p>
+    <w:p>
+      <w:pPr>
+        <w:bidi/>
+        <w:jc w:val="right"/>
+        <w:spacing w:after="40"/>
+      </w:pPr>
+      <w:r>
+        <w:rPr>
+          <w:rFonts w:ascii="Arial" w:hAnsi="Arial" w:cs="Arial"/>
+          <w:rtl/>
+          <w:sz w:val="22"/>
+          <w:szCs w:val="22"/>
+        </w:rPr>
+        <w:t xml:space="preserve">السابع عشر: قائمة الأدلة المطلوبة — صنفها إلى: احتياج واستحقاق، تصميم واعتمادات، شراء وتعاقد، تنفيذ واستلام، مالية، قياس أثر، وإغلاق.</w:t>
+      </w:r>
+    </w:p>
+    <w:p>
+      <w:pPr>
+        <w:bidi/>
+        <w:jc w:val="right"/>
+        <w:spacing w:after="40"/>
+      </w:pPr>
+      <w:r>
+        <w:rPr>
+          <w:rFonts w:ascii="Arial" w:hAnsi="Arial" w:cs="Arial"/>
+          <w:rtl/>
+          <w:sz w:val="22"/>
+          <w:szCs w:val="22"/>
+        </w:rPr>
+        <w:t xml:space="preserve">الثامن عشر: بوابات القرار — ضع قرار Go / Revise / Stop عند نهاية مراحل الفكرة، التحقق، التصميم، الميزانية، التعاقد، التنفيذ والإغلاق، مع شروط كل قرار.</w:t>
+      </w:r>
+    </w:p>
+    <w:p>
+      <w:pPr>
+        <w:bidi/>
+        <w:jc w:val="right"/>
+        <w:spacing w:after="40"/>
+      </w:pPr>
+      <w:r>
+        <w:rPr>
+          <w:rFonts w:ascii="Arial" w:hAnsi="Arial" w:cs="Arial"/>
+          <w:rtl/>
+          <w:sz w:val="22"/>
+          <w:szCs w:val="22"/>
+        </w:rPr>
+        <w:t xml:space="preserve">التاسع عشر: قائمة النواقص والأسئلة الحرجة — لا تزيد على 12 سؤالًا، مرتبة حسب ما يمنع اعتماد المشروع.</w:t>
+      </w:r>
+    </w:p>
+    <w:p>
+      <w:pPr>
+        <w:bidi/>
+        <w:jc w:val="right"/>
+        <w:spacing w:after="40"/>
+      </w:pPr>
+      <w:r>
+        <w:rPr>
+          <w:rFonts w:ascii="Arial" w:hAnsi="Arial" w:cs="Arial"/>
+          <w:rtl/>
+          <w:sz w:val="20"/>
+          <w:szCs w:val="20"/>
+        </w:rPr>
+        <w:t xml:space="preserve"/>
+      </w:r>
+    </w:p>
+    <w:p>
+      <w:pPr>
+        <w:bidi/>
+        <w:jc w:val="right"/>
+        <w:spacing w:after="60"/>
+      </w:pPr>
+      <w:r>
+        <w:rPr>
+          <w:rFonts w:ascii="Arial" w:hAnsi="Arial" w:cs="Arial"/>
+          <w:rtl/>
+          <w:sz w:val="24"/>
+          <w:szCs w:val="24"/>
+          <w:b/>
+          <w:color w:val="0D5C4A"/>
+        </w:rPr>
+        <w:t xml:space="preserve">صيغة الإخراج المطلوبة:</w:t>
+      </w:r>
+    </w:p>
+    <w:p>
+      <w:pPr>
+        <w:bidi/>
+        <w:jc w:val="right"/>
+        <w:spacing w:after="40"/>
+      </w:pPr>
+      <w:r>
+        <w:rPr>
+          <w:rFonts w:ascii="Arial" w:hAnsi="Arial" w:cs="Arial"/>
+          <w:rtl/>
+          <w:sz w:val="22"/>
+          <w:szCs w:val="22"/>
+        </w:rPr>
+        <w:t xml:space="preserve">- اكتب بالعربية المهنية الواضحة وباتجاه منطقي مناسب للمستندات التنفيذية.</w:t>
+      </w:r>
+    </w:p>
+    <w:p>
+      <w:pPr>
+        <w:bidi/>
+        <w:jc w:val="right"/>
+        <w:spacing w:after="40"/>
+      </w:pPr>
+      <w:r>
+        <w:rPr>
+          <w:rFonts w:ascii="Arial" w:hAnsi="Arial" w:cs="Arial"/>
+          <w:rtl/>
+          <w:sz w:val="22"/>
+          <w:szCs w:val="22"/>
+        </w:rPr>
+        <w:t xml:space="preserve">- استخدم جداول للميزانية، الخطة الزمنية، المؤشرات، المخاطر، RACI، وقائمة الأدلة.</w:t>
+      </w:r>
+    </w:p>
+    <w:p>
+      <w:pPr>
+        <w:bidi/>
+        <w:jc w:val="right"/>
+        <w:spacing w:after="40"/>
+      </w:pPr>
+      <w:r>
+        <w:rPr>
+          <w:rFonts w:ascii="Arial" w:hAnsi="Arial" w:cs="Arial"/>
+          <w:rtl/>
+          <w:sz w:val="22"/>
+          <w:szCs w:val="22"/>
+        </w:rPr>
+        <w:t xml:space="preserve">- استخدم أرقامًا فقط إذا كانت مقدمة في البيانات أو عرّفها صراحة كافتراض قابل للتعديل.</w:t>
+      </w:r>
+    </w:p>
+    <w:p>
+      <w:pPr>
+        <w:bidi/>
+        <w:jc w:val="right"/>
+        <w:spacing w:after="40"/>
+      </w:pPr>
+      <w:r>
+        <w:rPr>
+          <w:rFonts w:ascii="Arial" w:hAnsi="Arial" w:cs="Arial"/>
+          <w:rtl/>
+          <w:sz w:val="22"/>
+          <w:szCs w:val="22"/>
+        </w:rPr>
+        <w:t xml:space="preserve">- ضع في نهاية الدراسة قسمًا بعنوان: سجل الافتراضات ونقاط التحقق.</w:t>
+      </w:r>
+    </w:p>
+    <w:p>
+      <w:pPr>
+        <w:bidi/>
+        <w:jc w:val="right"/>
+        <w:spacing w:after="40"/>
+      </w:pPr>
+      <w:r>
+        <w:rPr>
+          <w:rFonts w:ascii="Arial" w:hAnsi="Arial" w:cs="Arial"/>
+          <w:rtl/>
+          <w:sz w:val="22"/>
+          <w:szCs w:val="22"/>
+        </w:rPr>
+        <w:t xml:space="preserve">- اختم بصفحة تنفيذية بعنوان: جاهزية المشروع للرفع/التمويل، تشمل ما اكتمل وما بقي وما يمنع البدء.</w:t>
+      </w:r>
+    </w:p>
+    <w:p>
+      <w:pPr>
+        <w:bidi/>
+        <w:jc w:val="right"/>
+        <w:spacing w:after="40"/>
+      </w:pPr>
+      <w:r>
+        <w:rPr>
+          <w:rFonts w:ascii="Arial" w:hAnsi="Arial" w:cs="Arial"/>
+          <w:rtl/>
+          <w:sz w:val="20"/>
+          <w:szCs w:val="20"/>
+        </w:rPr>
+        <w:t xml:space="preserve"/>
+      </w:r>
+    </w:p>
+    <w:p>
+      <w:pPr>
+        <w:bidi/>
+        <w:jc w:val="right"/>
+        <w:spacing w:after="40"/>
+      </w:pPr>
+      <w:r>
+        <w:rPr>
+          <w:rFonts w:ascii="Arial" w:hAnsi="Arial" w:cs="Arial"/>
+          <w:rtl/>
+          <w:sz w:val="22"/>
+          <w:szCs w:val="22"/>
+        </w:rPr>
+        <w:t xml:space="preserve">ابدأ الآن بإنتاج الدراسة كاملة وفق ما سبق، ولا تحذف أي مرحلة من مراحل دورة المشروع من الفكرة حتى الإغلاق.</w:t>
+      </w:r>
+    </w:p>
+    <w:p>
+      <w:pPr>
+        <w:bidi/>
+        <w:jc w:val="right"/>
+        <w:spacing w:after="80"/>
+      </w:pPr>
+      <w:r>
+        <w:rPr>
+          <w:rFonts w:ascii="Arial" w:hAnsi="Arial" w:cs="Arial"/>
+          <w:rtl/>
+          <w:sz w:val="20"/>
+          <w:szCs w:val="20"/>
+          <w:color w:val="666666"/>
+        </w:rPr>
+        <w:t xml:space="preserve">ملاحظة استخدام: عند توفر مستندات أو ضوابط أو عروض أسعار أو بيانات مستفيدين، أرفقها مع المطالبة واطلب من النموذج الاعتماد عليها بوصفها المصدر الأساسي وعدم استكمال الفجوات من عنده.</w:t>
       </w:r>
     </w:p>
     <w:sectPr>

</xml_diff>